<commit_message>
fix: remove redundant mention of bed management agent in Patient Management section
</commit_message>
<xml_diff>
--- a/AssignmentDocs/SE3110_G20_Assignment_Testing_Report.docx
+++ b/AssignmentDocs/SE3110_G20_Assignment_Testing_Report.docx
@@ -668,11 +668,6 @@
               <w:rStyle w:val="IndexLink"/>
             </w:rPr>
             <w:instrText xml:space="preserve"> TOC \o "1-2" \h</w:instrText>
-          </w:r>
-          <w:r>
-            <w:rPr>
-              <w:rStyle w:val="IndexLink"/>
-            </w:rPr>
             <w:fldChar w:fldCharType="separate"/>
           </w:r>
           <w:hyperlink w:anchor="__RefHeading___Toc1818_2017139870">
@@ -18720,7 +18715,7 @@
             </w:pPr>
             <w:r>
               <w:rPr/>
-              <w:t>Patient Management (Component 4): patient intake, bed management, patient care advisory agent and bed management agent</w:t>
+              <w:t>Patient Management (Component 4): patient intake, bed management, patient care advisory agent</w:t>
             </w:r>
           </w:p>
         </w:tc>

</xml_diff>